<commit_message>
docs: strengthen experiment and transfer assessment
</commit_message>
<xml_diff>
--- a/methodical-development/Assessment_materials.docx
+++ b/methodical-development/Assessment_materials.docx
@@ -42,14 +42,7 @@
         <w:jc w:val="both"/>
       </w:pPr>
       <w:r>
-        <w:rPr>
-          <w:rFonts w:ascii="Times New Roman" w:hAnsi="Times New Roman" w:eastAsia="Times New Roman" w:cs="Times New Roman"/>
-          <w:b/>
-          <w:i w:val="0"/>
-          <w:color w:val="000000"/>
-          <w:sz w:val="22"/>
-        </w:rPr>
-        <w:t>Комплект включает входной мини-тест, групповой практический кейс с тремя заложенными проблемами, два равноценных варианта индивидуальной итоговой задачи и отдельные ключи учителя.</w:t>
+        <w:t>Комплект включает входной мини-тест, групповой практический кейс с тремя заложенными проблемами, два равноценных варианта индивидуальной итоговой задачи на новой машине и отдельные ключи учителя.</w:t>
       </w:r>
     </w:p>
     <w:p>
@@ -481,15 +474,7 @@
               <w:spacing w:before="0" w:after="0" w:line="252" w:lineRule="auto"/>
               <w:jc w:val="left"/>
             </w:pPr>
-            <w:r/>
-            <w:r>
-              <w:rPr>
-                <w:rFonts w:ascii="Times New Roman" w:hAnsi="Times New Roman" w:eastAsia="Times New Roman" w:cs="Times New Roman"/>
-                <w:b/>
-                <w:i w:val="0"/>
-                <w:color w:val="000000"/>
-                <w:sz w:val="18"/>
-              </w:rPr>
+            <w:r>
               <w:t>Итоговая задача: вариант А или Б</w:t>
             </w:r>
           </w:p>
@@ -510,15 +495,7 @@
               <w:spacing w:before="0" w:after="0" w:line="252" w:lineRule="auto"/>
               <w:jc w:val="left"/>
             </w:pPr>
-            <w:r/>
-            <w:r>
-              <w:rPr>
-                <w:rFonts w:ascii="Times New Roman" w:hAnsi="Times New Roman" w:eastAsia="Times New Roman" w:cs="Times New Roman"/>
-                <w:b w:val="0"/>
-                <w:i w:val="0"/>
-                <w:color w:val="000000"/>
-                <w:sz w:val="18"/>
-              </w:rPr>
+            <w:r>
               <w:t>Каждый ученик</w:t>
             </w:r>
           </w:p>
@@ -539,15 +516,7 @@
               <w:spacing w:before="0" w:after="0" w:line="252" w:lineRule="auto"/>
               <w:jc w:val="left"/>
             </w:pPr>
-            <w:r/>
-            <w:r>
-              <w:rPr>
-                <w:rFonts w:ascii="Times New Roman" w:hAnsi="Times New Roman" w:eastAsia="Times New Roman" w:cs="Times New Roman"/>
-                <w:b w:val="0"/>
-                <w:i w:val="0"/>
-                <w:color w:val="000000"/>
-                <w:sz w:val="18"/>
-              </w:rPr>
+            <w:r>
               <w:t>3–5 минут</w:t>
             </w:r>
           </w:p>
@@ -568,16 +537,8 @@
               <w:spacing w:before="0" w:after="0" w:line="252" w:lineRule="auto"/>
               <w:jc w:val="left"/>
             </w:pPr>
-            <w:r/>
-            <w:r>
-              <w:rPr>
-                <w:rFonts w:ascii="Times New Roman" w:hAnsi="Times New Roman" w:eastAsia="Times New Roman" w:cs="Times New Roman"/>
-                <w:b w:val="0"/>
-                <w:i w:val="0"/>
-                <w:color w:val="000000"/>
-                <w:sz w:val="18"/>
-              </w:rPr>
-              <w:t>Проверить аналитический перенос без подсказок</w:t>
+            <w:r>
+              <w:t>Проверить перенос способа на новую машину без подсказок</w:t>
             </w:r>
           </w:p>
         </w:tc>
@@ -2720,14 +2681,7 @@
         <w:jc w:val="both"/>
       </w:pPr>
       <w:r>
-        <w:rPr>
-          <w:rFonts w:ascii="Times New Roman" w:hAnsi="Times New Roman" w:eastAsia="Times New Roman" w:cs="Times New Roman"/>
-          <w:b w:val="0"/>
-          <w:i w:val="0"/>
-          <w:color w:val="000000"/>
-          <w:sz w:val="21"/>
-        </w:rPr>
-        <w:t>На ленте записаны 17 единиц подряд. Головка находится над первой единицей, начальное состояние erase. Машина движется только вправо и работает по таблице.</w:t>
+        <w:t>На ленте записаны 20 единиц подряд. Головка находится над первой единицей, начальное состояние keep. Машина движется только вправо и работает по таблице.</w:t>
       </w:r>
     </w:p>
     <w:tbl>
@@ -2772,15 +2726,7 @@
               <w:spacing w:before="0" w:after="0" w:line="252" w:lineRule="auto"/>
               <w:jc w:val="left"/>
             </w:pPr>
-            <w:r/>
-            <w:r>
-              <w:rPr>
-                <w:rFonts w:ascii="Times New Roman" w:hAnsi="Times New Roman" w:eastAsia="Times New Roman" w:cs="Times New Roman"/>
-                <w:b/>
-                <w:i w:val="0"/>
-                <w:color w:val="000000"/>
-                <w:sz w:val="20"/>
-              </w:rPr>
+            <w:r>
               <w:t>Состояние</w:t>
             </w:r>
           </w:p>
@@ -2802,15 +2748,7 @@
               <w:spacing w:before="0" w:after="0" w:line="252" w:lineRule="auto"/>
               <w:jc w:val="left"/>
             </w:pPr>
-            <w:r/>
-            <w:r>
-              <w:rPr>
-                <w:rFonts w:ascii="Times New Roman" w:hAnsi="Times New Roman" w:eastAsia="Times New Roman" w:cs="Times New Roman"/>
-                <w:b/>
-                <w:i w:val="0"/>
-                <w:color w:val="000000"/>
-                <w:sz w:val="20"/>
-              </w:rPr>
+            <w:r>
               <w:t>1</w:t>
             </w:r>
           </w:p>
@@ -2832,15 +2770,7 @@
               <w:spacing w:before="0" w:after="0" w:line="252" w:lineRule="auto"/>
               <w:jc w:val="left"/>
             </w:pPr>
-            <w:r/>
-            <w:r>
-              <w:rPr>
-                <w:rFonts w:ascii="Times New Roman" w:hAnsi="Times New Roman" w:eastAsia="Times New Roman" w:cs="Times New Roman"/>
-                <w:b/>
-                <w:i w:val="0"/>
-                <w:color w:val="000000"/>
-                <w:sz w:val="20"/>
-              </w:rPr>
+            <w:r>
               <w:t>λ</w:t>
             </w:r>
           </w:p>
@@ -2867,16 +2797,8 @@
               <w:spacing w:before="0" w:after="0" w:line="252" w:lineRule="auto"/>
               <w:jc w:val="left"/>
             </w:pPr>
-            <w:r/>
-            <w:r>
-              <w:rPr>
-                <w:rFonts w:ascii="Times New Roman" w:hAnsi="Times New Roman" w:eastAsia="Times New Roman" w:cs="Times New Roman"/>
-                <w:b/>
-                <w:i w:val="0"/>
-                <w:color w:val="000000"/>
-                <w:sz w:val="20"/>
-              </w:rPr>
-              <w:t>erase</w:t>
+            <w:r>
+              <w:t>keep</w:t>
             </w:r>
           </w:p>
         </w:tc>
@@ -2896,16 +2818,8 @@
               <w:spacing w:before="0" w:after="0" w:line="252" w:lineRule="auto"/>
               <w:jc w:val="left"/>
             </w:pPr>
-            <w:r/>
-            <w:r>
-              <w:rPr>
-                <w:rFonts w:ascii="Times New Roman" w:hAnsi="Times New Roman" w:eastAsia="Times New Roman" w:cs="Times New Roman"/>
-                <w:b w:val="0"/>
-                <w:i w:val="0"/>
-                <w:color w:val="000000"/>
-                <w:sz w:val="20"/>
-              </w:rPr>
-              <w:t>λ, R, keep</w:t>
+            <w:r>
+              <w:t>1, R, erase1</w:t>
             </w:r>
           </w:p>
         </w:tc>
@@ -2925,15 +2839,7 @@
               <w:spacing w:before="0" w:after="0" w:line="252" w:lineRule="auto"/>
               <w:jc w:val="left"/>
             </w:pPr>
-            <w:r/>
-            <w:r>
-              <w:rPr>
-                <w:rFonts w:ascii="Times New Roman" w:hAnsi="Times New Roman" w:eastAsia="Times New Roman" w:cs="Times New Roman"/>
-                <w:b w:val="0"/>
-                <w:i w:val="0"/>
-                <w:color w:val="000000"/>
-                <w:sz w:val="20"/>
-              </w:rPr>
+            <w:r>
               <w:t>λ, S, halt</w:t>
             </w:r>
           </w:p>
@@ -2960,16 +2866,8 @@
               <w:spacing w:before="0" w:after="0" w:line="252" w:lineRule="auto"/>
               <w:jc w:val="left"/>
             </w:pPr>
-            <w:r/>
-            <w:r>
-              <w:rPr>
-                <w:rFonts w:ascii="Times New Roman" w:hAnsi="Times New Roman" w:eastAsia="Times New Roman" w:cs="Times New Roman"/>
-                <w:b/>
-                <w:i w:val="0"/>
-                <w:color w:val="000000"/>
-                <w:sz w:val="20"/>
-              </w:rPr>
-              <w:t>keep</w:t>
+            <w:r>
+              <w:t>erase1</w:t>
             </w:r>
           </w:p>
         </w:tc>
@@ -2989,16 +2887,8 @@
               <w:spacing w:before="0" w:after="0" w:line="252" w:lineRule="auto"/>
               <w:jc w:val="left"/>
             </w:pPr>
-            <w:r/>
-            <w:r>
-              <w:rPr>
-                <w:rFonts w:ascii="Times New Roman" w:hAnsi="Times New Roman" w:eastAsia="Times New Roman" w:cs="Times New Roman"/>
-                <w:b w:val="0"/>
-                <w:i w:val="0"/>
-                <w:color w:val="000000"/>
-                <w:sz w:val="20"/>
-              </w:rPr>
-              <w:t>1, R, erase</w:t>
+            <w:r>
+              <w:t>λ, R, erase2</w:t>
             </w:r>
           </w:p>
         </w:tc>
@@ -3018,15 +2908,76 @@
               <w:spacing w:before="0" w:after="0" w:line="252" w:lineRule="auto"/>
               <w:jc w:val="left"/>
             </w:pPr>
-            <w:r/>
-            <w:r>
-              <w:rPr>
-                <w:rFonts w:ascii="Times New Roman" w:hAnsi="Times New Roman" w:eastAsia="Times New Roman" w:cs="Times New Roman"/>
-                <w:b w:val="0"/>
-                <w:i w:val="0"/>
-                <w:color w:val="000000"/>
-                <w:sz w:val="20"/>
-              </w:rPr>
+            <w:r>
+              <w:t>λ, S, halt</w:t>
+            </w:r>
+          </w:p>
+        </w:tc>
+      </w:tr>
+      <w:tr>
+        <w:trPr>
+          <w:cantSplit/>
+        </w:trPr>
+        <w:tc>
+          <w:tcPr>
+            <w:tcW w:type="dxa" w:w="2232"/>
+            <w:vAlign w:val="center"/>
+            <w:tcMar>
+              <w:top w:w="110" w:type="dxa"/>
+              <w:start w:w="125" w:type="dxa"/>
+              <w:bottom w:w="110" w:type="dxa"/>
+              <w:end w:w="125" w:type="dxa"/>
+            </w:tcMar>
+            <w:shd w:fill="F3F8EF"/>
+          </w:tcPr>
+          <w:p>
+            <w:pPr>
+              <w:spacing w:before="0" w:after="0" w:line="252" w:lineRule="auto"/>
+              <w:jc w:val="left"/>
+            </w:pPr>
+            <w:r>
+              <w:t>erase2</w:t>
+            </w:r>
+          </w:p>
+        </w:tc>
+        <w:tc>
+          <w:tcPr>
+            <w:tcW w:type="dxa" w:w="4104"/>
+            <w:vAlign w:val="center"/>
+            <w:tcMar>
+              <w:top w:w="110" w:type="dxa"/>
+              <w:start w:w="125" w:type="dxa"/>
+              <w:bottom w:w="110" w:type="dxa"/>
+              <w:end w:w="125" w:type="dxa"/>
+            </w:tcMar>
+          </w:tcPr>
+          <w:p>
+            <w:pPr>
+              <w:spacing w:before="0" w:after="0" w:line="252" w:lineRule="auto"/>
+              <w:jc w:val="left"/>
+            </w:pPr>
+            <w:r>
+              <w:t>λ, R, keep</w:t>
+            </w:r>
+          </w:p>
+        </w:tc>
+        <w:tc>
+          <w:tcPr>
+            <w:tcW w:type="dxa" w:w="3744"/>
+            <w:vAlign w:val="center"/>
+            <w:tcMar>
+              <w:top w:w="110" w:type="dxa"/>
+              <w:start w:w="125" w:type="dxa"/>
+              <w:bottom w:w="110" w:type="dxa"/>
+              <w:end w:w="125" w:type="dxa"/>
+            </w:tcMar>
+          </w:tcPr>
+          <w:p>
+            <w:pPr>
+              <w:spacing w:before="0" w:after="0" w:line="252" w:lineRule="auto"/>
+              <w:jc w:val="left"/>
+            </w:pPr>
+            <w:r>
               <w:t>λ, S, halt</w:t>
             </w:r>
           </w:p>
@@ -3216,14 +3167,7 @@
         <w:jc w:val="left"/>
       </w:pPr>
       <w:r>
-        <w:rPr>
-          <w:rFonts w:ascii="Times New Roman" w:hAnsi="Times New Roman" w:eastAsia="Times New Roman" w:cs="Times New Roman"/>
-          <w:b/>
-          <w:i w:val="0"/>
-          <w:color w:val="000000"/>
-          <w:sz w:val="21"/>
-        </w:rPr>
-        <w:t>Как проверен нечётный остаток</w:t>
+        <w:t>Как обработан остаток после полных троек</w:t>
       </w:r>
     </w:p>
     <w:tbl>
@@ -3509,14 +3453,7 @@
         <w:jc w:val="both"/>
       </w:pPr>
       <w:r>
-        <w:rPr>
-          <w:rFonts w:ascii="Times New Roman" w:hAnsi="Times New Roman" w:eastAsia="Times New Roman" w:cs="Times New Roman"/>
-          <w:b w:val="0"/>
-          <w:i w:val="0"/>
-          <w:color w:val="000000"/>
-          <w:sz w:val="21"/>
-        </w:rPr>
-        <w:t>На ленте записаны 18 единиц подряд. Головка находится над первой единицей, начальное состояние erase. Машина движется только вправо и работает по таблице.</w:t>
+        <w:t>На ленте записаны 22 единицы подряд. Головка находится над первой единицей, начальное состояние keep. Машина движется только вправо и работает по таблице.</w:t>
       </w:r>
     </w:p>
     <w:tbl>
@@ -3561,15 +3498,7 @@
               <w:spacing w:before="0" w:after="0" w:line="252" w:lineRule="auto"/>
               <w:jc w:val="left"/>
             </w:pPr>
-            <w:r/>
-            <w:r>
-              <w:rPr>
-                <w:rFonts w:ascii="Times New Roman" w:hAnsi="Times New Roman" w:eastAsia="Times New Roman" w:cs="Times New Roman"/>
-                <w:b/>
-                <w:i w:val="0"/>
-                <w:color w:val="000000"/>
-                <w:sz w:val="20"/>
-              </w:rPr>
+            <w:r>
               <w:t>Состояние</w:t>
             </w:r>
           </w:p>
@@ -3591,15 +3520,7 @@
               <w:spacing w:before="0" w:after="0" w:line="252" w:lineRule="auto"/>
               <w:jc w:val="left"/>
             </w:pPr>
-            <w:r/>
-            <w:r>
-              <w:rPr>
-                <w:rFonts w:ascii="Times New Roman" w:hAnsi="Times New Roman" w:eastAsia="Times New Roman" w:cs="Times New Roman"/>
-                <w:b/>
-                <w:i w:val="0"/>
-                <w:color w:val="000000"/>
-                <w:sz w:val="20"/>
-              </w:rPr>
+            <w:r>
               <w:t>1</w:t>
             </w:r>
           </w:p>
@@ -3621,15 +3542,7 @@
               <w:spacing w:before="0" w:after="0" w:line="252" w:lineRule="auto"/>
               <w:jc w:val="left"/>
             </w:pPr>
-            <w:r/>
-            <w:r>
-              <w:rPr>
-                <w:rFonts w:ascii="Times New Roman" w:hAnsi="Times New Roman" w:eastAsia="Times New Roman" w:cs="Times New Roman"/>
-                <w:b/>
-                <w:i w:val="0"/>
-                <w:color w:val="000000"/>
-                <w:sz w:val="20"/>
-              </w:rPr>
+            <w:r>
               <w:t>λ</w:t>
             </w:r>
           </w:p>
@@ -3656,16 +3569,8 @@
               <w:spacing w:before="0" w:after="0" w:line="252" w:lineRule="auto"/>
               <w:jc w:val="left"/>
             </w:pPr>
-            <w:r/>
-            <w:r>
-              <w:rPr>
-                <w:rFonts w:ascii="Times New Roman" w:hAnsi="Times New Roman" w:eastAsia="Times New Roman" w:cs="Times New Roman"/>
-                <w:b/>
-                <w:i w:val="0"/>
-                <w:color w:val="000000"/>
-                <w:sz w:val="20"/>
-              </w:rPr>
-              <w:t>erase</w:t>
+            <w:r>
+              <w:t>keep</w:t>
             </w:r>
           </w:p>
         </w:tc>
@@ -3685,16 +3590,8 @@
               <w:spacing w:before="0" w:after="0" w:line="252" w:lineRule="auto"/>
               <w:jc w:val="left"/>
             </w:pPr>
-            <w:r/>
-            <w:r>
-              <w:rPr>
-                <w:rFonts w:ascii="Times New Roman" w:hAnsi="Times New Roman" w:eastAsia="Times New Roman" w:cs="Times New Roman"/>
-                <w:b w:val="0"/>
-                <w:i w:val="0"/>
-                <w:color w:val="000000"/>
-                <w:sz w:val="20"/>
-              </w:rPr>
-              <w:t>λ, R, keep</w:t>
+            <w:r>
+              <w:t>1, R, erase1</w:t>
             </w:r>
           </w:p>
         </w:tc>
@@ -3714,15 +3611,7 @@
               <w:spacing w:before="0" w:after="0" w:line="252" w:lineRule="auto"/>
               <w:jc w:val="left"/>
             </w:pPr>
-            <w:r/>
-            <w:r>
-              <w:rPr>
-                <w:rFonts w:ascii="Times New Roman" w:hAnsi="Times New Roman" w:eastAsia="Times New Roman" w:cs="Times New Roman"/>
-                <w:b w:val="0"/>
-                <w:i w:val="0"/>
-                <w:color w:val="000000"/>
-                <w:sz w:val="20"/>
-              </w:rPr>
+            <w:r>
               <w:t>λ, S, halt</w:t>
             </w:r>
           </w:p>
@@ -3749,16 +3638,8 @@
               <w:spacing w:before="0" w:after="0" w:line="252" w:lineRule="auto"/>
               <w:jc w:val="left"/>
             </w:pPr>
-            <w:r/>
-            <w:r>
-              <w:rPr>
-                <w:rFonts w:ascii="Times New Roman" w:hAnsi="Times New Roman" w:eastAsia="Times New Roman" w:cs="Times New Roman"/>
-                <w:b/>
-                <w:i w:val="0"/>
-                <w:color w:val="000000"/>
-                <w:sz w:val="20"/>
-              </w:rPr>
-              <w:t>keep</w:t>
+            <w:r>
+              <w:t>erase1</w:t>
             </w:r>
           </w:p>
         </w:tc>
@@ -3778,16 +3659,8 @@
               <w:spacing w:before="0" w:after="0" w:line="252" w:lineRule="auto"/>
               <w:jc w:val="left"/>
             </w:pPr>
-            <w:r/>
-            <w:r>
-              <w:rPr>
-                <w:rFonts w:ascii="Times New Roman" w:hAnsi="Times New Roman" w:eastAsia="Times New Roman" w:cs="Times New Roman"/>
-                <w:b w:val="0"/>
-                <w:i w:val="0"/>
-                <w:color w:val="000000"/>
-                <w:sz w:val="20"/>
-              </w:rPr>
-              <w:t>1, R, erase</w:t>
+            <w:r>
+              <w:t>λ, R, erase2</w:t>
             </w:r>
           </w:p>
         </w:tc>
@@ -3807,15 +3680,76 @@
               <w:spacing w:before="0" w:after="0" w:line="252" w:lineRule="auto"/>
               <w:jc w:val="left"/>
             </w:pPr>
-            <w:r/>
-            <w:r>
-              <w:rPr>
-                <w:rFonts w:ascii="Times New Roman" w:hAnsi="Times New Roman" w:eastAsia="Times New Roman" w:cs="Times New Roman"/>
-                <w:b w:val="0"/>
-                <w:i w:val="0"/>
-                <w:color w:val="000000"/>
-                <w:sz w:val="20"/>
-              </w:rPr>
+            <w:r>
+              <w:t>λ, S, halt</w:t>
+            </w:r>
+          </w:p>
+        </w:tc>
+      </w:tr>
+      <w:tr>
+        <w:trPr>
+          <w:cantSplit/>
+        </w:trPr>
+        <w:tc>
+          <w:tcPr>
+            <w:tcW w:type="dxa" w:w="2232"/>
+            <w:vAlign w:val="center"/>
+            <w:tcMar>
+              <w:top w:w="110" w:type="dxa"/>
+              <w:start w:w="125" w:type="dxa"/>
+              <w:bottom w:w="110" w:type="dxa"/>
+              <w:end w:w="125" w:type="dxa"/>
+            </w:tcMar>
+            <w:shd w:fill="F3F8EF"/>
+          </w:tcPr>
+          <w:p>
+            <w:pPr>
+              <w:spacing w:before="0" w:after="0" w:line="252" w:lineRule="auto"/>
+              <w:jc w:val="left"/>
+            </w:pPr>
+            <w:r>
+              <w:t>erase2</w:t>
+            </w:r>
+          </w:p>
+        </w:tc>
+        <w:tc>
+          <w:tcPr>
+            <w:tcW w:type="dxa" w:w="4104"/>
+            <w:vAlign w:val="center"/>
+            <w:tcMar>
+              <w:top w:w="110" w:type="dxa"/>
+              <w:start w:w="125" w:type="dxa"/>
+              <w:bottom w:w="110" w:type="dxa"/>
+              <w:end w:w="125" w:type="dxa"/>
+            </w:tcMar>
+          </w:tcPr>
+          <w:p>
+            <w:pPr>
+              <w:spacing w:before="0" w:after="0" w:line="252" w:lineRule="auto"/>
+              <w:jc w:val="left"/>
+            </w:pPr>
+            <w:r>
+              <w:t>λ, R, keep</w:t>
+            </w:r>
+          </w:p>
+        </w:tc>
+        <w:tc>
+          <w:tcPr>
+            <w:tcW w:type="dxa" w:w="3744"/>
+            <w:vAlign w:val="center"/>
+            <w:tcMar>
+              <w:top w:w="110" w:type="dxa"/>
+              <w:start w:w="125" w:type="dxa"/>
+              <w:bottom w:w="110" w:type="dxa"/>
+              <w:end w:w="125" w:type="dxa"/>
+            </w:tcMar>
+          </w:tcPr>
+          <w:p>
+            <w:pPr>
+              <w:spacing w:before="0" w:after="0" w:line="252" w:lineRule="auto"/>
+              <w:jc w:val="left"/>
+            </w:pPr>
+            <w:r>
               <w:t>λ, S, halt</w:t>
             </w:r>
           </w:p>
@@ -4005,14 +3939,7 @@
         <w:jc w:val="left"/>
       </w:pPr>
       <w:r>
-        <w:rPr>
-          <w:rFonts w:ascii="Times New Roman" w:hAnsi="Times New Roman" w:eastAsia="Times New Roman" w:cs="Times New Roman"/>
-          <w:b/>
-          <w:i w:val="0"/>
-          <w:color w:val="000000"/>
-          <w:sz w:val="21"/>
-        </w:rPr>
-        <w:t>Как проверен случай чётной длины</w:t>
+        <w:t>Как обработан остаток после полных троек</w:t>
       </w:r>
     </w:p>
     <w:tbl>
@@ -5295,14 +5222,7 @@
         <w:jc w:val="both"/>
       </w:pPr>
       <w:r>
-        <w:rPr>
-          <w:rFonts w:ascii="Times New Roman" w:hAnsi="Times New Roman" w:eastAsia="Times New Roman" w:cs="Times New Roman"/>
-          <w:b w:val="0"/>
-          <w:i w:val="0"/>
-          <w:color w:val="000000"/>
-          <w:sz w:val="21"/>
-        </w:rPr>
-        <w:t>Две последовательные команды образуют цикл: erase стирает первую единицу пары и переводит машину в keep; keep сохраняет вторую единицу и возвращает состояние erase. Каждая полная пара оставляет одну единицу.</w:t>
+        <w:t>Три последовательные команды образуют цикл: keep сохраняет первую единицу, erase1 стирает вторую, erase2 стирает третью. Каждая полная тройка оставляет одну единицу. После полных троек остаток нужно разобрать отдельно, начиная снова с состояния keep.</w:t>
       </w:r>
     </w:p>
     <w:tbl>
@@ -5349,15 +5269,7 @@
               <w:spacing w:before="0" w:after="0" w:line="252" w:lineRule="auto"/>
               <w:jc w:val="left"/>
             </w:pPr>
-            <w:r/>
-            <w:r>
-              <w:rPr>
-                <w:rFonts w:ascii="Times New Roman" w:hAnsi="Times New Roman" w:eastAsia="Times New Roman" w:cs="Times New Roman"/>
-                <w:b/>
-                <w:i w:val="0"/>
-                <w:color w:val="000000"/>
-                <w:sz w:val="18"/>
-              </w:rPr>
+            <w:r>
               <w:t>Вариант</w:t>
             </w:r>
           </w:p>
@@ -5379,15 +5291,7 @@
               <w:spacing w:before="0" w:after="0" w:line="252" w:lineRule="auto"/>
               <w:jc w:val="left"/>
             </w:pPr>
-            <w:r/>
-            <w:r>
-              <w:rPr>
-                <w:rFonts w:ascii="Times New Roman" w:hAnsi="Times New Roman" w:eastAsia="Times New Roman" w:cs="Times New Roman"/>
-                <w:b/>
-                <w:i w:val="0"/>
-                <w:color w:val="000000"/>
-                <w:sz w:val="18"/>
-              </w:rPr>
+            <w:r>
               <w:t>Длина</w:t>
             </w:r>
           </w:p>
@@ -5409,16 +5313,8 @@
               <w:spacing w:before="0" w:after="0" w:line="252" w:lineRule="auto"/>
               <w:jc w:val="left"/>
             </w:pPr>
-            <w:r/>
-            <w:r>
-              <w:rPr>
-                <w:rFonts w:ascii="Times New Roman" w:hAnsi="Times New Roman" w:eastAsia="Times New Roman" w:cs="Times New Roman"/>
-                <w:b/>
-                <w:i w:val="0"/>
-                <w:color w:val="000000"/>
-                <w:sz w:val="18"/>
-              </w:rPr>
-              <w:t>Пары и остаток</w:t>
+            <w:r>
+              <w:t>Тройки и остаток</w:t>
             </w:r>
           </w:p>
         </w:tc>
@@ -5439,15 +5335,7 @@
               <w:spacing w:before="0" w:after="0" w:line="252" w:lineRule="auto"/>
               <w:jc w:val="left"/>
             </w:pPr>
-            <w:r/>
-            <w:r>
-              <w:rPr>
-                <w:rFonts w:ascii="Times New Roman" w:hAnsi="Times New Roman" w:eastAsia="Times New Roman" w:cs="Times New Roman"/>
-                <w:b/>
-                <w:i w:val="0"/>
-                <w:color w:val="000000"/>
-                <w:sz w:val="18"/>
-              </w:rPr>
+            <w:r>
               <w:t>Ответ</w:t>
             </w:r>
           </w:p>
@@ -5469,15 +5357,7 @@
               <w:spacing w:before="0" w:after="0" w:line="252" w:lineRule="auto"/>
               <w:jc w:val="left"/>
             </w:pPr>
-            <w:r/>
-            <w:r>
-              <w:rPr>
-                <w:rFonts w:ascii="Times New Roman" w:hAnsi="Times New Roman" w:eastAsia="Times New Roman" w:cs="Times New Roman"/>
-                <w:b/>
-                <w:i w:val="0"/>
-                <w:color w:val="000000"/>
-                <w:sz w:val="18"/>
-              </w:rPr>
+            <w:r>
               <w:t>Проверяемое обоснование</w:t>
             </w:r>
           </w:p>
@@ -5503,15 +5383,7 @@
               <w:spacing w:before="0" w:after="0" w:line="252" w:lineRule="auto"/>
               <w:jc w:val="left"/>
             </w:pPr>
-            <w:r/>
-            <w:r>
-              <w:rPr>
-                <w:rFonts w:ascii="Times New Roman" w:hAnsi="Times New Roman" w:eastAsia="Times New Roman" w:cs="Times New Roman"/>
-                <w:b w:val="0"/>
-                <w:i w:val="0"/>
-                <w:color w:val="000000"/>
-                <w:sz w:val="18"/>
-              </w:rPr>
+            <w:r>
               <w:t>А</w:t>
             </w:r>
           </w:p>
@@ -5532,16 +5404,8 @@
               <w:spacing w:before="0" w:after="0" w:line="252" w:lineRule="auto"/>
               <w:jc w:val="left"/>
             </w:pPr>
-            <w:r/>
-            <w:r>
-              <w:rPr>
-                <w:rFonts w:ascii="Times New Roman" w:hAnsi="Times New Roman" w:eastAsia="Times New Roman" w:cs="Times New Roman"/>
-                <w:b w:val="0"/>
-                <w:i w:val="0"/>
-                <w:color w:val="000000"/>
-                <w:sz w:val="18"/>
-              </w:rPr>
-              <w:t>17</w:t>
+            <w:r>
+              <w:t>20</w:t>
             </w:r>
           </w:p>
         </w:tc>
@@ -5561,16 +5425,8 @@
               <w:spacing w:before="0" w:after="0" w:line="252" w:lineRule="auto"/>
               <w:jc w:val="left"/>
             </w:pPr>
-            <w:r/>
-            <w:r>
-              <w:rPr>
-                <w:rFonts w:ascii="Times New Roman" w:hAnsi="Times New Roman" w:eastAsia="Times New Roman" w:cs="Times New Roman"/>
-                <w:b w:val="0"/>
-                <w:i w:val="0"/>
-                <w:color w:val="000000"/>
-                <w:sz w:val="18"/>
-              </w:rPr>
-              <w:t>8 полных пар и 1 лишняя единица</w:t>
+            <w:r>
+              <w:t>6 полных троек и 2 единицы остатка</w:t>
             </w:r>
           </w:p>
         </w:tc>
@@ -5590,16 +5446,8 @@
               <w:spacing w:before="0" w:after="0" w:line="252" w:lineRule="auto"/>
               <w:jc w:val="left"/>
             </w:pPr>
-            <w:r/>
-            <w:r>
-              <w:rPr>
-                <w:rFonts w:ascii="Times New Roman" w:hAnsi="Times New Roman" w:eastAsia="Times New Roman" w:cs="Times New Roman"/>
-                <w:b w:val="0"/>
-                <w:i w:val="0"/>
-                <w:color w:val="000000"/>
-                <w:sz w:val="18"/>
-              </w:rPr>
-              <w:t>8</w:t>
+            <w:r>
+              <w:t>7</w:t>
             </w:r>
           </w:p>
         </w:tc>
@@ -5619,16 +5467,8 @@
               <w:spacing w:before="0" w:after="0" w:line="252" w:lineRule="auto"/>
               <w:jc w:val="left"/>
             </w:pPr>
-            <w:r/>
-            <w:r>
-              <w:rPr>
-                <w:rFonts w:ascii="Times New Roman" w:hAnsi="Times New Roman" w:eastAsia="Times New Roman" w:cs="Times New Roman"/>
-                <w:b w:val="0"/>
-                <w:i w:val="0"/>
-                <w:color w:val="000000"/>
-                <w:sz w:val="18"/>
-              </w:rPr>
-              <w:t>Восемь вторых единиц пар сохраняются; лишняя семнадцатая стирается в erase</w:t>
+            <w:r>
+              <w:t>По одной единице из шести троек и одна из остатка; 20-я единица стирается</w:t>
             </w:r>
           </w:p>
         </w:tc>
@@ -5653,15 +5493,7 @@
               <w:spacing w:before="0" w:after="0" w:line="252" w:lineRule="auto"/>
               <w:jc w:val="left"/>
             </w:pPr>
-            <w:r/>
-            <w:r>
-              <w:rPr>
-                <w:rFonts w:ascii="Times New Roman" w:hAnsi="Times New Roman" w:eastAsia="Times New Roman" w:cs="Times New Roman"/>
-                <w:b w:val="0"/>
-                <w:i w:val="0"/>
-                <w:color w:val="000000"/>
-                <w:sz w:val="18"/>
-              </w:rPr>
+            <w:r>
               <w:t>Б</w:t>
             </w:r>
           </w:p>
@@ -5682,16 +5514,8 @@
               <w:spacing w:before="0" w:after="0" w:line="252" w:lineRule="auto"/>
               <w:jc w:val="left"/>
             </w:pPr>
-            <w:r/>
-            <w:r>
-              <w:rPr>
-                <w:rFonts w:ascii="Times New Roman" w:hAnsi="Times New Roman" w:eastAsia="Times New Roman" w:cs="Times New Roman"/>
-                <w:b w:val="0"/>
-                <w:i w:val="0"/>
-                <w:color w:val="000000"/>
-                <w:sz w:val="18"/>
-              </w:rPr>
-              <w:t>18</w:t>
+            <w:r>
+              <w:t>22</w:t>
             </w:r>
           </w:p>
         </w:tc>
@@ -5711,16 +5535,8 @@
               <w:spacing w:before="0" w:after="0" w:line="252" w:lineRule="auto"/>
               <w:jc w:val="left"/>
             </w:pPr>
-            <w:r/>
-            <w:r>
-              <w:rPr>
-                <w:rFonts w:ascii="Times New Roman" w:hAnsi="Times New Roman" w:eastAsia="Times New Roman" w:cs="Times New Roman"/>
-                <w:b w:val="0"/>
-                <w:i w:val="0"/>
-                <w:color w:val="000000"/>
-                <w:sz w:val="18"/>
-              </w:rPr>
-              <w:t>9 полных пар без остатка</w:t>
+            <w:r>
+              <w:t>7 полных троек и 1 единица остатка</w:t>
             </w:r>
           </w:p>
         </w:tc>
@@ -5740,16 +5556,8 @@
               <w:spacing w:before="0" w:after="0" w:line="252" w:lineRule="auto"/>
               <w:jc w:val="left"/>
             </w:pPr>
-            <w:r/>
-            <w:r>
-              <w:rPr>
-                <w:rFonts w:ascii="Times New Roman" w:hAnsi="Times New Roman" w:eastAsia="Times New Roman" w:cs="Times New Roman"/>
-                <w:b w:val="0"/>
-                <w:i w:val="0"/>
-                <w:color w:val="000000"/>
-                <w:sz w:val="18"/>
-              </w:rPr>
-              <w:t>9</w:t>
+            <w:r>
+              <w:t>8</w:t>
             </w:r>
           </w:p>
         </w:tc>
@@ -5769,16 +5577,8 @@
               <w:spacing w:before="0" w:after="0" w:line="252" w:lineRule="auto"/>
               <w:jc w:val="left"/>
             </w:pPr>
-            <w:r/>
-            <w:r>
-              <w:rPr>
-                <w:rFonts w:ascii="Times New Roman" w:hAnsi="Times New Roman" w:eastAsia="Times New Roman" w:cs="Times New Roman"/>
-                <w:b w:val="0"/>
-                <w:i w:val="0"/>
-                <w:color w:val="000000"/>
-                <w:sz w:val="18"/>
-              </w:rPr>
-              <w:t>Каждая из девяти пар оставляет вторую единицу</w:t>
+            <w:r>
+              <w:t>По одной единице из семи троек и одна из остатка</w:t>
             </w:r>
           </w:p>
         </w:tc>
@@ -6036,15 +5836,7 @@
               <w:spacing w:before="0" w:after="0" w:line="252" w:lineRule="auto"/>
               <w:jc w:val="left"/>
             </w:pPr>
-            <w:r/>
-            <w:r>
-              <w:rPr>
-                <w:rFonts w:ascii="Times New Roman" w:hAnsi="Times New Roman" w:eastAsia="Times New Roman" w:cs="Times New Roman"/>
-                <w:b/>
-                <w:i w:val="0"/>
-                <w:color w:val="000000"/>
-                <w:sz w:val="18"/>
-              </w:rPr>
+            <w:r>
               <w:t>Цикл</w:t>
             </w:r>
           </w:p>
@@ -6065,15 +5857,7 @@
               <w:spacing w:before="0" w:after="0" w:line="252" w:lineRule="auto"/>
               <w:jc w:val="left"/>
             </w:pPr>
-            <w:r/>
-            <w:r>
-              <w:rPr>
-                <w:rFonts w:ascii="Times New Roman" w:hAnsi="Times New Roman" w:eastAsia="Times New Roman" w:cs="Times New Roman"/>
-                <w:b w:val="0"/>
-                <w:i w:val="0"/>
-                <w:color w:val="000000"/>
-                <w:sz w:val="18"/>
-              </w:rPr>
+            <w:r>
               <w:t>2</w:t>
             </w:r>
           </w:p>
@@ -6094,16 +5878,8 @@
               <w:spacing w:before="0" w:after="0" w:line="252" w:lineRule="auto"/>
               <w:jc w:val="left"/>
             </w:pPr>
-            <w:r/>
-            <w:r>
-              <w:rPr>
-                <w:rFonts w:ascii="Times New Roman" w:hAnsi="Times New Roman" w:eastAsia="Times New Roman" w:cs="Times New Roman"/>
-                <w:b w:val="0"/>
-                <w:i w:val="0"/>
-                <w:color w:val="000000"/>
-                <w:sz w:val="18"/>
-              </w:rPr>
-              <w:t>Верно описаны действия erase и keep и результат одной пары</w:t>
+            <w:r>
+              <w:t>Верно описаны действия keep, erase1 и erase2 и результат одной тройки</w:t>
             </w:r>
           </w:p>
         </w:tc>
@@ -6129,16 +5905,8 @@
               <w:spacing w:before="0" w:after="0" w:line="252" w:lineRule="auto"/>
               <w:jc w:val="left"/>
             </w:pPr>
-            <w:r/>
-            <w:r>
-              <w:rPr>
-                <w:rFonts w:ascii="Times New Roman" w:hAnsi="Times New Roman" w:eastAsia="Times New Roman" w:cs="Times New Roman"/>
-                <w:b/>
-                <w:i w:val="0"/>
-                <w:color w:val="000000"/>
-                <w:sz w:val="18"/>
-              </w:rPr>
-              <w:t>Граница</w:t>
+            <w:r>
+              <w:t>Остаток</w:t>
             </w:r>
           </w:p>
         </w:tc>
@@ -6158,15 +5926,7 @@
               <w:spacing w:before="0" w:after="0" w:line="252" w:lineRule="auto"/>
               <w:jc w:val="left"/>
             </w:pPr>
-            <w:r/>
-            <w:r>
-              <w:rPr>
-                <w:rFonts w:ascii="Times New Roman" w:hAnsi="Times New Roman" w:eastAsia="Times New Roman" w:cs="Times New Roman"/>
-                <w:b w:val="0"/>
-                <w:i w:val="0"/>
-                <w:color w:val="000000"/>
-                <w:sz w:val="18"/>
-              </w:rPr>
+            <w:r>
               <w:t>1</w:t>
             </w:r>
           </w:p>
@@ -6187,16 +5947,8 @@
               <w:spacing w:before="0" w:after="0" w:line="252" w:lineRule="auto"/>
               <w:jc w:val="left"/>
             </w:pPr>
-            <w:r/>
-            <w:r>
-              <w:rPr>
-                <w:rFonts w:ascii="Times New Roman" w:hAnsi="Times New Roman" w:eastAsia="Times New Roman" w:cs="Times New Roman"/>
-                <w:b w:val="0"/>
-                <w:i w:val="0"/>
-                <w:color w:val="000000"/>
-                <w:sz w:val="18"/>
-              </w:rPr>
-              <w:t>Для варианта А обработан нечётный остаток; для варианта Б отмечено его отсутствие</w:t>
+            <w:r>
+              <w:t>Остаток после полных троек разобран с учётом состояния keep</w:t>
             </w:r>
           </w:p>
         </w:tc>

</xml_diff>

<commit_message>
docs: simplify remaining student materials
</commit_message>
<xml_diff>
--- a/methodical-development/Assessment_materials.docx
+++ b/methodical-development/Assessment_materials.docx
@@ -912,7 +912,7 @@
           <w:color w:val="000000"/>
           <w:sz w:val="21"/>
         </w:rPr>
-        <w:t>В каком порядке машина выполняет части команды?</w:t>
+        <w:t>Что машина делает в одной команде и в каком порядке?</w:t>
       </w:r>
     </w:p>
     <w:p>
@@ -930,7 +930,7 @@
           <w:color w:val="000000"/>
           <w:sz w:val="21"/>
         </w:rPr>
-        <w:t>• А движение запись состояние</w:t>
+        <w:t>• А движение, запись, состояние</w:t>
       </w:r>
     </w:p>
     <w:p>
@@ -948,7 +948,7 @@
           <w:color w:val="000000"/>
           <w:sz w:val="21"/>
         </w:rPr>
-        <w:t>• Б запись движение состояние</w:t>
+        <w:t>• Б запись, движение, состояние</w:t>
       </w:r>
     </w:p>
     <w:p>
@@ -966,7 +966,7 @@
           <w:color w:val="000000"/>
           <w:sz w:val="21"/>
         </w:rPr>
-        <w:t>• В состояние движение запись</w:t>
+        <w:t>• В состояние, движение, запись</w:t>
       </w:r>
     </w:p>
     <w:p>
@@ -1017,7 +1017,7 @@
           <w:color w:val="000000"/>
           <w:sz w:val="21"/>
         </w:rPr>
-        <w:t>Что означает частичное использование симулятора?</w:t>
+        <w:t>Что значит использовать тренажёр только для проверки?</w:t>
       </w:r>
     </w:p>
     <w:p>
@@ -1035,7 +1035,7 @@
           <w:color w:val="000000"/>
           <w:sz w:val="21"/>
         </w:rPr>
-        <w:t>• А выполнено несколько шагов для проверки гипотезы</w:t>
+        <w:t>• А выполнить несколько шагов и проверить своё предположение</w:t>
       </w:r>
     </w:p>
     <w:p>
@@ -1053,7 +1053,7 @@
           <w:color w:val="000000"/>
           <w:sz w:val="21"/>
         </w:rPr>
-        <w:t>• Б машина обязательно доведена до остановки</w:t>
+        <w:t>• Б обязательно довести машину до остановки</w:t>
       </w:r>
     </w:p>
     <w:p>
@@ -1071,7 +1071,7 @@
           <w:color w:val="000000"/>
           <w:sz w:val="21"/>
         </w:rPr>
-        <w:t>• В ответ выбран без анализа таблицы</w:t>
+        <w:t>• В выбрать ответ, не разбирая таблицу команд</w:t>
       </w:r>
     </w:p>
     <w:p>
@@ -1122,7 +1122,7 @@
           <w:color w:val="000000"/>
           <w:sz w:val="21"/>
         </w:rPr>
-        <w:t>Почему полная трассировка длинной однонаправленной машины может быть избыточной?</w:t>
+        <w:t>Почему не всегда нужно полностью трассировать длинную машину, которая движется только в одну сторону?</w:t>
       </w:r>
     </w:p>
     <w:p>
@@ -1139,7 +1139,7 @@
           <w:color w:val="000000"/>
           <w:sz w:val="21"/>
         </w:rPr>
-        <w:t>Короткий ответ</w:t>
+        <w:t>Объясните коротко</w:t>
       </w:r>
     </w:p>
     <w:tbl>
@@ -1232,7 +1232,7 @@
           <w:color w:val="000000"/>
           <w:sz w:val="21"/>
         </w:rPr>
-        <w:t>Что должно подтвердить найденную закономерность перед включением в диагностический маршрут?</w:t>
+        <w:t>Как проверить найденное правило перед тем, как добавить его в маршрут?</w:t>
       </w:r>
     </w:p>
     <w:p>
@@ -1249,7 +1249,7 @@
           <w:color w:val="000000"/>
           <w:sz w:val="21"/>
         </w:rPr>
-        <w:t>Назовите два вида подтверждения</w:t>
+        <w:t>Назовите два способа проверки</w:t>
       </w:r>
     </w:p>
     <w:tbl>
@@ -1849,7 +1849,7 @@
           <w:color w:val="000000"/>
           <w:sz w:val="30"/>
         </w:rPr>
-        <w:t>Объяснение для проверки</w:t>
+        <w:t>Объяснение, которое нужно проверить</w:t>
       </w:r>
     </w:p>
     <w:p>
@@ -1883,7 +1883,7 @@
           <w:color w:val="000000"/>
           <w:sz w:val="21"/>
         </w:rPr>
-        <w:t>Найдите три ошибки или необоснованных утверждения. Для каждого укажите исправление и короткий способ проверки.</w:t>
+        <w:t>Найдите три ошибки или спорных утверждения. Для каждого запишите исправление и короткую проверку.</w:t>
       </w:r>
     </w:p>
     <w:tbl>
@@ -1968,7 +1968,7 @@
                 <w:color w:val="000000"/>
                 <w:sz w:val="18"/>
               </w:rPr>
-              <w:t>Почему неверно</w:t>
+              <w:t>В чём ошибка</w:t>
             </w:r>
           </w:p>
         </w:tc>
@@ -1998,7 +1998,7 @@
                 <w:color w:val="000000"/>
                 <w:sz w:val="18"/>
               </w:rPr>
-              <w:t>Исправление</w:t>
+              <w:t>Как исправить</w:t>
             </w:r>
           </w:p>
         </w:tc>
@@ -2028,7 +2028,7 @@
                 <w:color w:val="000000"/>
                 <w:sz w:val="18"/>
               </w:rPr>
-              <w:t>Короткая проверка</w:t>
+              <w:t>Как проверить</w:t>
             </w:r>
           </w:p>
         </w:tc>
@@ -2410,7 +2410,7 @@
           <w:color w:val="000000"/>
           <w:sz w:val="21"/>
         </w:rPr>
-        <w:t>Исправленное объяснение целиком</w:t>
+        <w:t>Запишите правильное объяснение целиком</w:t>
       </w:r>
     </w:p>
     <w:tbl>
@@ -3003,7 +3003,7 @@
           <w:color w:val="000000"/>
           <w:sz w:val="21"/>
         </w:rPr>
-        <w:t>Сколько единиц останется после остановки машины? Решите аналитически. Полная трассировка не требуется.</w:t>
+        <w:t>Сколько единиц останется после остановки? Найдите правило и решите без полной трассировки.</w:t>
       </w:r>
     </w:p>
     <w:p>
@@ -3096,7 +3096,7 @@
           <w:color w:val="000000"/>
           <w:sz w:val="21"/>
         </w:rPr>
-        <w:t>Повторяющийся фрагмент или правило</w:t>
+        <w:t>Что повторяется? Какое правило вы нашли?</w:t>
       </w:r>
     </w:p>
     <w:tbl>
@@ -3167,7 +3167,7 @@
         <w:jc w:val="left"/>
       </w:pPr>
       <w:r>
-        <w:t>Как обработан остаток после полных троек</w:t>
+        <w:t>Что происходит с остатком после полных троек</w:t>
       </w:r>
     </w:p>
     <w:tbl>
@@ -3244,7 +3244,7 @@
           <w:color w:val="000000"/>
           <w:sz w:val="20"/>
         </w:rPr>
-        <w:t>Выбранная стратегия: полная трассировка [ ]  несколько проверочных шагов [ ]  аналитическое решение [ ]</w:t>
+        <w:t>Выбранный способ: полная трассировка [ ] несколько проверочных шагов [ ] аналитическое решение [ ]</w:t>
       </w:r>
     </w:p>
     <w:p>
@@ -3775,7 +3775,7 @@
           <w:color w:val="000000"/>
           <w:sz w:val="21"/>
         </w:rPr>
-        <w:t>Сколько единиц останется после остановки машины? Решите аналитически. Полная трассировка не требуется.</w:t>
+        <w:t>Сколько единиц останется после остановки? Найдите правило и решите без полной трассировки.</w:t>
       </w:r>
     </w:p>
     <w:p>
@@ -3868,7 +3868,7 @@
           <w:color w:val="000000"/>
           <w:sz w:val="21"/>
         </w:rPr>
-        <w:t>Повторяющийся фрагмент или правило</w:t>
+        <w:t>Что повторяется? Какое правило вы нашли?</w:t>
       </w:r>
     </w:p>
     <w:tbl>
@@ -3939,7 +3939,7 @@
         <w:jc w:val="left"/>
       </w:pPr>
       <w:r>
-        <w:t>Как обработан остаток после полных троек</w:t>
+        <w:t>Что происходит с остатком после полных троек</w:t>
       </w:r>
     </w:p>
     <w:tbl>
@@ -4016,7 +4016,7 @@
           <w:color w:val="000000"/>
           <w:sz w:val="20"/>
         </w:rPr>
-        <w:t>Выбранная стратегия: полная трассировка [ ]  несколько проверочных шагов [ ]  аналитическое решение [ ]</w:t>
+        <w:t>Выбранный способ: полная трассировка [ ] несколько проверочных шагов [ ] аналитическое решение [ ]</w:t>
       </w:r>
     </w:p>
     <w:p>

</xml_diff>